<commit_message>
Perbaiki bug + security: bind sesi RPC jawaban/submit, guard ACTIVE, hapus pass_hash, cek kode duplikat, XSS escape (esc) + event delegation, fix crash mTopik, fix lock terkirim stale & timer
</commit_message>
<xml_diff>
--- a/template/25_Soal_TKA_Bahasa_Indonesia_SD_MI_Literasi.docx
+++ b/template/25_Soal_TKA_Bahasa_Indonesia_SD_MI_Literasi.docx
@@ -17,23 +17,25 @@
           <w:color w:val="1D4ED8"/>
           <w:sz w:val="26"/>
         </w:rPr>
-        <w:t xml:space="preserve">KODE SOAL: </w:t>
-      </w:r>
-      <w:r>
+        <w:t>KODE SOAL: BI-2026-001</w:t>
+      </w:r>
+    </w:p>
+    <w:p>
+      <w:pPr>
+        <w:pStyle w:val="Normal"/>
         <w:rPr>
           <w:b/>
           <w:color w:val="1D4ED8"/>
           <w:sz w:val="26"/>
         </w:rPr>
-        <w:t>BI</w:t>
-      </w:r>
+      </w:pPr>
       <w:r>
         <w:rPr>
           <w:b/>
           <w:color w:val="1D4ED8"/>
           <w:sz w:val="26"/>
         </w:rPr>
-        <w:t>-2026-001</w:t>
+        <w:t>JENJANG: SD</w:t>
       </w:r>
     </w:p>
     <w:p>
@@ -72,9 +74,6 @@
       </w:r>
       <w:r>
         <w:rPr/>
-        <w:t>Bacalah teks berikut!</w:t>
-        <w:br/>
-        <w:br/>
         <w:t>Setiap pagi, Raka membantu ibunya menata pot tanaman di teras. Ia memindahkan pot yang terlalu berat dengan meminta bantuan ayah. Setelah itu, Raka menyiram tanaman secukupnya. Ia tidak menyiram berlebihan karena air yang terlalu banyak dapat membuat akar tanaman membusuk.</w:t>
       </w:r>
     </w:p>
@@ -212,9 +211,6 @@
       </w:r>
       <w:r>
         <w:rPr/>
-        <w:t>Bacalah teks berikut!</w:t>
-        <w:br/>
-        <w:br/>
         <w:t>Hujan turun sejak sore. Jalan di depan rumah Dito mulai tergenang karena saluran air tertutup daun dan sampah. Dito bersama kakaknya membersihkan sampah tersebut menggunakan alat yang sesuai. Beberapa saat kemudian, air mulai mengalir kembali.</w:t>
       </w:r>
     </w:p>
@@ -282,9 +278,6 @@
       </w:r>
       <w:r>
         <w:rPr/>
-        <w:t>Bacalah teks berikut!</w:t>
-        <w:br/>
-        <w:br/>
         <w:t>Mira membawa dua botol minum saat pergi ke sekolah. Satu botol berisi air putih, sedangkan botol lainnya berisi teh manis. Saat istirahat, Mira memilih air putih karena ia ingin mengurangi minuman yang terlalu manis. Ia tetap meminum teh tersebut setelah makan siang, tetapi tidak setiap hari.</w:t>
       </w:r>
     </w:p>
@@ -352,9 +345,6 @@
       </w:r>
       <w:r>
         <w:rPr/>
-        <w:t>Bacalah teks berikut!</w:t>
-        <w:br/>
-        <w:br/>
         <w:t>Pada hari Sabtu, warga Kampung Melati mengadakan kerja bakti. Anak-anak mengumpulkan daun kering, sedangkan orang dewasa membersihkan selokan. Setelah pekerjaan selesai, warga memisahkan sampah yang dapat didaur ulang dari sampah lainnya.</w:t>
       </w:r>
     </w:p>
@@ -422,9 +412,6 @@
       </w:r>
       <w:r>
         <w:rPr/>
-        <w:t>Bacalah teks berikut!</w:t>
-        <w:br/>
-        <w:br/>
         <w:t>Pagi itu, langit tampak mendung. Sinta tetap membawa payung sebelum berangkat sekolah. Ketika jam pulang tiba, hujan turun deras. Teman Sinta yang tidak membawa payung akhirnya ikut berteduh bersamanya.</w:t>
       </w:r>
     </w:p>
@@ -492,9 +479,6 @@
       </w:r>
       <w:r>
         <w:rPr/>
-        <w:t>Bacalah teks berikut!</w:t>
-        <w:br/>
-        <w:br/>
         <w:t>Pak Arman membuat rak buku dari kayu bekas. Ia mengukur setiap papan sebelum memotongnya. Menurut Pak Arman, mengukur dengan teliti dapat mengurangi kesalahan dan menghemat bahan.</w:t>
       </w:r>
     </w:p>
@@ -562,9 +546,6 @@
       </w:r>
       <w:r>
         <w:rPr/>
-        <w:t>Bacalah teks berikut!</w:t>
-        <w:br/>
-        <w:br/>
         <w:t>Sekolah Lani memiliki taman kecil di samping kelas. Dahulu taman itu jarang dirawat sehingga banyak rumput liar tumbuh. Setelah siswa membuat jadwal piket, taman menjadi lebih bersih. Setiap kelompok bertugas mencabut rumput liar dan menyiram tanaman sesuai jadwal.</w:t>
       </w:r>
     </w:p>
@@ -632,9 +613,6 @@
       </w:r>
       <w:r>
         <w:rPr/>
-        <w:t>Bacalah teks berikut!</w:t>
-        <w:br/>
-        <w:br/>
         <w:t>Bacaan digital dapat membantu siswa memperoleh informasi dengan cepat. Namun, siswa tetap perlu memeriksa sumber dan membandingkan informasi sebelum mempercayainya. Tidak semua informasi yang ditemukan di internet benar.</w:t>
       </w:r>
     </w:p>
@@ -772,9 +750,6 @@
       </w:r>
       <w:r>
         <w:rPr/>
-        <w:t>Bacalah teks berikut!</w:t>
-        <w:br/>
-        <w:br/>
         <w:t>Dara membaca petunjuk membuat kompos. Sisa sayuran dan daun kering dimasukkan ke wadah, kemudian dijaga agar tetap lembap. Bahan tersebut perlu diaduk secara berkala agar proses penguraian berlangsung dengan baik.</w:t>
       </w:r>
     </w:p>
@@ -842,9 +817,6 @@
       </w:r>
       <w:r>
         <w:rPr/>
-        <w:t>Bacalah teks berikut!</w:t>
-        <w:br/>
-        <w:br/>
         <w:t>Di kelas, guru meminta siswa memilih ketua kelompok. Arif mengusulkan nama Bima karena Bima sering membantu teman memahami tugas. Siswa lain menyetujui usulan tersebut setelah berdiskusi.</w:t>
       </w:r>
     </w:p>
@@ -912,9 +884,6 @@
       </w:r>
       <w:r>
         <w:rPr/>
-        <w:t>Bacalah teks berikut!</w:t>
-        <w:br/>
-        <w:br/>
         <w:t>Rani menemukan seekor anak burung di bawah pohon. Ia tidak langsung membawanya pulang. Rani mengamati dari kejauhan dan melihat induknya datang mendekat. Rani kemudian meninggalkan anak burung itu agar tetap bersama induknya.</w:t>
       </w:r>
     </w:p>
@@ -982,9 +951,6 @@
       </w:r>
       <w:r>
         <w:rPr/>
-        <w:t>Bacalah teks berikut!</w:t>
-        <w:br/>
-        <w:br/>
         <w:t>Setelah listrik padam, keluarga Tono membuka jendela agar udara tetap masuk. Mereka menggunakan lampu darurat untuk penerangan. Tono tidak menyalakan semua alat elektronik karena beberapa alat tidak diperlukan saat itu.</w:t>
       </w:r>
     </w:p>
@@ -1052,9 +1018,6 @@
       </w:r>
       <w:r>
         <w:rPr/>
-        <w:t>Bacalah teks berikut!</w:t>
-        <w:br/>
-        <w:br/>
         <w:t>Di sebuah desa, terdapat mata air yang digunakan warga untuk memenuhi kebutuhan sehari-hari. Warga membuat aturan agar tidak membuang sampah dan tidak mencuci kendaraan di sekitar mata air. Aturan tersebut disepakati setelah warga melihat kualitas air mulai menurun.</w:t>
       </w:r>
     </w:p>
@@ -1122,9 +1085,6 @@
       </w:r>
       <w:r>
         <w:rPr/>
-        <w:t>Bacalah teks berikut!</w:t>
-        <w:br/>
-        <w:br/>
         <w:t>Fahmi memiliki kebiasaan membaca selama lima belas menit sebelum tidur. Pada awalnya ia sering mengantuk dan sulit berkonsentrasi. Setelah beberapa minggu, Fahmi mulai terbiasa dan dapat menyelesaikan bacaan dengan lebih baik.</w:t>
       </w:r>
     </w:p>
@@ -1192,9 +1152,6 @@
       </w:r>
       <w:r>
         <w:rPr/>
-        <w:t>Bacalah teks berikut!</w:t>
-        <w:br/>
-        <w:br/>
         <w:t>Ketika membuat poster tentang hemat air, kelompok Sari menulis kalimat singkat dan memilih gambar keran yang tertutup. Mereka tidak memasukkan terlalu banyak tulisan agar pesan mudah dipahami orang yang melihatnya.</w:t>
       </w:r>
     </w:p>
@@ -1262,9 +1219,6 @@
       </w:r>
       <w:r>
         <w:rPr/>
-        <w:t>Bacalah teks berikut!</w:t>
-        <w:br/>
-        <w:br/>
         <w:t>Tiga siswa mencatat jumlah sampah plastik yang mereka temukan di halaman selama tiga hari. Hari pertama terdapat 18 bungkus, hari kedua 12 bungkus, dan hari ketiga 7 bungkus. Mereka menyimpulkan bahwa halaman menjadi lebih bersih setelah kegiatan piket dilakukan secara rutin.</w:t>
       </w:r>
     </w:p>
@@ -1332,9 +1286,6 @@
       </w:r>
       <w:r>
         <w:rPr/>
-        <w:t>Bacalah teks berikut!</w:t>
-        <w:br/>
-        <w:br/>
         <w:t>Alya terlambat mengumpulkan tugas karena lupa mencatat batas waktu. Setelah mendapat pengingat dari guru, Alya mulai menuliskan semua tenggat tugas di kalender belajarnya. Ia berharap tidak mengulangi kesalahan yang sama.</w:t>
       </w:r>
     </w:p>
@@ -1402,9 +1353,6 @@
       </w:r>
       <w:r>
         <w:rPr/>
-        <w:t>Bacalah teks berikut!</w:t>
-        <w:br/>
-        <w:br/>
         <w:t>Sebuah poster di sekolah berbunyi: “Bawa bekal dari rumah. Gunakan wadah yang dapat dipakai berulang kali. Kurangi sampah kemasan sekali pakai.” Poster tersebut dipasang di dekat kantin.</w:t>
       </w:r>
     </w:p>
@@ -1472,9 +1420,6 @@
       </w:r>
       <w:r>
         <w:rPr/>
-        <w:t>Bacalah teks berikut!</w:t>
-        <w:br/>
-        <w:br/>
         <w:t>Nenek membuat jamu dari bahan yang ditanam sendiri di kebunnya. Ia mencuci bahan tersebut sebelum mengolahnya. Nenek mengatakan bahwa menjaga kebersihan bahan makanan merupakan bagian penting dalam menyiapkan minuman.</w:t>
       </w:r>
     </w:p>
@@ -1542,9 +1487,6 @@
       </w:r>
       <w:r>
         <w:rPr/>
-        <w:t>Bacalah teks berikut!</w:t>
-        <w:br/>
-        <w:br/>
         <w:t>Ruang kelas yang penuh buku membuat siswa kesulitan bergerak. Guru kemudian mengajak siswa menyusun buku berdasarkan jenisnya dan menempatkannya pada rak yang sesuai. Setelah ditata, ruang kelas menjadi lebih rapi dan siswa lebih mudah menemukan buku.</w:t>
       </w:r>
     </w:p>
@@ -1612,9 +1554,6 @@
       </w:r>
       <w:r>
         <w:rPr/>
-        <w:t>Bacalah teks berikut!</w:t>
-        <w:br/>
-        <w:br/>
         <w:t>Pada lomba membaca puisi, Wulan merasa gugup sebelum tampil. Ia menarik napas perlahan, membaca kembali puisinya, lalu tampil sesuai latihan. Setelah selesai, Wulan merasa lega karena telah berusaha sebaik mungkin.</w:t>
       </w:r>
     </w:p>
@@ -1682,9 +1621,6 @@
       </w:r>
       <w:r>
         <w:rPr/>
-        <w:t>Bacalah teks berikut!</w:t>
-        <w:br/>
-        <w:br/>
         <w:t>Di desa Purnama, warga mulai menggunakan lampu tenaga surya di beberapa jalan. Pada siang hari, panel menangkap energi matahari yang kemudian digunakan untuk menyalakan lampu pada malam hari. Warga berharap penerangan tetap tersedia sekaligus memanfaatkan sumber energi yang tersedia di lingkungan mereka.</w:t>
       </w:r>
     </w:p>
@@ -1752,9 +1688,6 @@
       </w:r>
       <w:r>
         <w:rPr/>
-        <w:t>Bacalah teks berikut!</w:t>
-        <w:br/>
-        <w:br/>
         <w:t>Rafa membaca dua berita tentang kebersihan sungai. Berita pertama menyebutkan bahwa warga melakukan kerja bakti setiap bulan. Berita kedua menyebutkan bahwa beberapa bagian sungai masih dipenuhi sampah. Rafa menyadari bahwa kegiatan kerja bakti perlu dilakukan bersama tindakan menjaga kebiasaan tidak membuang sampah.</w:t>
       </w:r>
     </w:p>
@@ -2363,6 +2296,7 @@
         </w:tabs>
         <w:ind w:left="1080" w:hanging="360"/>
       </w:pPr>
+      <w:rPr/>
     </w:lvl>
     <w:lvl w:ilvl="2">
       <w:start w:val="1"/>
@@ -2375,6 +2309,7 @@
         </w:tabs>
         <w:ind w:left="1440" w:hanging="360"/>
       </w:pPr>
+      <w:rPr/>
     </w:lvl>
     <w:lvl w:ilvl="3">
       <w:start w:val="1"/>
@@ -2387,6 +2322,7 @@
         </w:tabs>
         <w:ind w:left="1800" w:hanging="360"/>
       </w:pPr>
+      <w:rPr/>
     </w:lvl>
     <w:lvl w:ilvl="4">
       <w:start w:val="1"/>
@@ -2399,6 +2335,7 @@
         </w:tabs>
         <w:ind w:left="2160" w:hanging="360"/>
       </w:pPr>
+      <w:rPr/>
     </w:lvl>
     <w:lvl w:ilvl="5">
       <w:start w:val="1"/>
@@ -2411,6 +2348,7 @@
         </w:tabs>
         <w:ind w:left="2520" w:hanging="360"/>
       </w:pPr>
+      <w:rPr/>
     </w:lvl>
     <w:lvl w:ilvl="6">
       <w:start w:val="1"/>
@@ -2423,6 +2361,7 @@
         </w:tabs>
         <w:ind w:left="2880" w:hanging="360"/>
       </w:pPr>
+      <w:rPr/>
     </w:lvl>
     <w:lvl w:ilvl="7">
       <w:start w:val="1"/>
@@ -2435,6 +2374,7 @@
         </w:tabs>
         <w:ind w:left="3240" w:hanging="360"/>
       </w:pPr>
+      <w:rPr/>
     </w:lvl>
     <w:lvl w:ilvl="8">
       <w:start w:val="1"/>
@@ -2447,6 +2387,7 @@
         </w:tabs>
         <w:ind w:left="3600" w:hanging="360"/>
       </w:pPr>
+      <w:rPr/>
     </w:lvl>
   </w:abstractNum>
   <w:abstractNum w:abstractNumId="2">
@@ -2476,6 +2417,7 @@
         </w:tabs>
         <w:ind w:left="1080" w:hanging="360"/>
       </w:pPr>
+      <w:rPr/>
     </w:lvl>
     <w:lvl w:ilvl="2">
       <w:start w:val="1"/>
@@ -2488,6 +2430,7 @@
         </w:tabs>
         <w:ind w:left="1440" w:hanging="360"/>
       </w:pPr>
+      <w:rPr/>
     </w:lvl>
     <w:lvl w:ilvl="3">
       <w:start w:val="1"/>
@@ -2500,6 +2443,7 @@
         </w:tabs>
         <w:ind w:left="1800" w:hanging="360"/>
       </w:pPr>
+      <w:rPr/>
     </w:lvl>
     <w:lvl w:ilvl="4">
       <w:start w:val="1"/>
@@ -2512,6 +2456,7 @@
         </w:tabs>
         <w:ind w:left="2160" w:hanging="360"/>
       </w:pPr>
+      <w:rPr/>
     </w:lvl>
     <w:lvl w:ilvl="5">
       <w:start w:val="1"/>
@@ -2524,6 +2469,7 @@
         </w:tabs>
         <w:ind w:left="2520" w:hanging="360"/>
       </w:pPr>
+      <w:rPr/>
     </w:lvl>
     <w:lvl w:ilvl="6">
       <w:start w:val="1"/>
@@ -2536,6 +2482,7 @@
         </w:tabs>
         <w:ind w:left="2880" w:hanging="360"/>
       </w:pPr>
+      <w:rPr/>
     </w:lvl>
     <w:lvl w:ilvl="7">
       <w:start w:val="1"/>
@@ -2548,6 +2495,7 @@
         </w:tabs>
         <w:ind w:left="3240" w:hanging="360"/>
       </w:pPr>
+      <w:rPr/>
     </w:lvl>
     <w:lvl w:ilvl="8">
       <w:start w:val="1"/>
@@ -2560,6 +2508,7 @@
         </w:tabs>
         <w:ind w:left="3600" w:hanging="360"/>
       </w:pPr>
+      <w:rPr/>
     </w:lvl>
   </w:abstractNum>
   <w:abstractNum w:abstractNumId="3">
@@ -2589,6 +2538,7 @@
         </w:tabs>
         <w:ind w:left="1080" w:hanging="360"/>
       </w:pPr>
+      <w:rPr/>
     </w:lvl>
     <w:lvl w:ilvl="2">
       <w:start w:val="1"/>
@@ -2601,6 +2551,7 @@
         </w:tabs>
         <w:ind w:left="1440" w:hanging="360"/>
       </w:pPr>
+      <w:rPr/>
     </w:lvl>
     <w:lvl w:ilvl="3">
       <w:start w:val="1"/>
@@ -2613,6 +2564,7 @@
         </w:tabs>
         <w:ind w:left="1800" w:hanging="360"/>
       </w:pPr>
+      <w:rPr/>
     </w:lvl>
     <w:lvl w:ilvl="4">
       <w:start w:val="1"/>
@@ -2625,6 +2577,7 @@
         </w:tabs>
         <w:ind w:left="2160" w:hanging="360"/>
       </w:pPr>
+      <w:rPr/>
     </w:lvl>
     <w:lvl w:ilvl="5">
       <w:start w:val="1"/>
@@ -2637,6 +2590,7 @@
         </w:tabs>
         <w:ind w:left="2520" w:hanging="360"/>
       </w:pPr>
+      <w:rPr/>
     </w:lvl>
     <w:lvl w:ilvl="6">
       <w:start w:val="1"/>
@@ -2649,6 +2603,7 @@
         </w:tabs>
         <w:ind w:left="2880" w:hanging="360"/>
       </w:pPr>
+      <w:rPr/>
     </w:lvl>
     <w:lvl w:ilvl="7">
       <w:start w:val="1"/>
@@ -2661,6 +2616,7 @@
         </w:tabs>
         <w:ind w:left="3240" w:hanging="360"/>
       </w:pPr>
+      <w:rPr/>
     </w:lvl>
     <w:lvl w:ilvl="8">
       <w:start w:val="1"/>
@@ -2673,6 +2629,7 @@
         </w:tabs>
         <w:ind w:left="3600" w:hanging="360"/>
       </w:pPr>
+      <w:rPr/>
     </w:lvl>
   </w:abstractNum>
   <w:abstractNum w:abstractNumId="4">
@@ -2700,6 +2657,7 @@
         </w:tabs>
         <w:ind w:left="1080" w:hanging="360"/>
       </w:pPr>
+      <w:rPr/>
     </w:lvl>
     <w:lvl w:ilvl="2">
       <w:start w:val="1"/>
@@ -2712,6 +2670,7 @@
         </w:tabs>
         <w:ind w:left="1440" w:hanging="360"/>
       </w:pPr>
+      <w:rPr/>
     </w:lvl>
     <w:lvl w:ilvl="3">
       <w:start w:val="1"/>
@@ -2724,6 +2683,7 @@
         </w:tabs>
         <w:ind w:left="1800" w:hanging="360"/>
       </w:pPr>
+      <w:rPr/>
     </w:lvl>
     <w:lvl w:ilvl="4">
       <w:start w:val="1"/>
@@ -2736,6 +2696,7 @@
         </w:tabs>
         <w:ind w:left="2160" w:hanging="360"/>
       </w:pPr>
+      <w:rPr/>
     </w:lvl>
     <w:lvl w:ilvl="5">
       <w:start w:val="1"/>
@@ -2748,6 +2709,7 @@
         </w:tabs>
         <w:ind w:left="2520" w:hanging="360"/>
       </w:pPr>
+      <w:rPr/>
     </w:lvl>
     <w:lvl w:ilvl="6">
       <w:start w:val="1"/>
@@ -2760,6 +2722,7 @@
         </w:tabs>
         <w:ind w:left="2880" w:hanging="360"/>
       </w:pPr>
+      <w:rPr/>
     </w:lvl>
     <w:lvl w:ilvl="7">
       <w:start w:val="1"/>
@@ -2772,6 +2735,7 @@
         </w:tabs>
         <w:ind w:left="3240" w:hanging="360"/>
       </w:pPr>
+      <w:rPr/>
     </w:lvl>
     <w:lvl w:ilvl="8">
       <w:start w:val="1"/>
@@ -2784,6 +2748,7 @@
         </w:tabs>
         <w:ind w:left="3600" w:hanging="360"/>
       </w:pPr>
+      <w:rPr/>
     </w:lvl>
   </w:abstractNum>
   <w:abstractNum w:abstractNumId="5">
@@ -2811,6 +2776,7 @@
         </w:tabs>
         <w:ind w:left="1080" w:hanging="360"/>
       </w:pPr>
+      <w:rPr/>
     </w:lvl>
     <w:lvl w:ilvl="2">
       <w:start w:val="1"/>
@@ -2823,6 +2789,7 @@
         </w:tabs>
         <w:ind w:left="1440" w:hanging="360"/>
       </w:pPr>
+      <w:rPr/>
     </w:lvl>
     <w:lvl w:ilvl="3">
       <w:start w:val="1"/>
@@ -2835,6 +2802,7 @@
         </w:tabs>
         <w:ind w:left="1800" w:hanging="360"/>
       </w:pPr>
+      <w:rPr/>
     </w:lvl>
     <w:lvl w:ilvl="4">
       <w:start w:val="1"/>
@@ -2847,6 +2815,7 @@
         </w:tabs>
         <w:ind w:left="2160" w:hanging="360"/>
       </w:pPr>
+      <w:rPr/>
     </w:lvl>
     <w:lvl w:ilvl="5">
       <w:start w:val="1"/>
@@ -2859,6 +2828,7 @@
         </w:tabs>
         <w:ind w:left="2520" w:hanging="360"/>
       </w:pPr>
+      <w:rPr/>
     </w:lvl>
     <w:lvl w:ilvl="6">
       <w:start w:val="1"/>
@@ -2871,6 +2841,7 @@
         </w:tabs>
         <w:ind w:left="2880" w:hanging="360"/>
       </w:pPr>
+      <w:rPr/>
     </w:lvl>
     <w:lvl w:ilvl="7">
       <w:start w:val="1"/>
@@ -2883,6 +2854,7 @@
         </w:tabs>
         <w:ind w:left="3240" w:hanging="360"/>
       </w:pPr>
+      <w:rPr/>
     </w:lvl>
     <w:lvl w:ilvl="8">
       <w:start w:val="1"/>
@@ -2895,6 +2867,7 @@
         </w:tabs>
         <w:ind w:left="3600" w:hanging="360"/>
       </w:pPr>
+      <w:rPr/>
     </w:lvl>
   </w:abstractNum>
   <w:abstractNum w:abstractNumId="6">
@@ -2922,6 +2895,7 @@
         </w:tabs>
         <w:ind w:left="1080" w:hanging="360"/>
       </w:pPr>
+      <w:rPr/>
     </w:lvl>
     <w:lvl w:ilvl="2">
       <w:start w:val="1"/>
@@ -2934,6 +2908,7 @@
         </w:tabs>
         <w:ind w:left="1440" w:hanging="360"/>
       </w:pPr>
+      <w:rPr/>
     </w:lvl>
     <w:lvl w:ilvl="3">
       <w:start w:val="1"/>
@@ -2946,6 +2921,7 @@
         </w:tabs>
         <w:ind w:left="1800" w:hanging="360"/>
       </w:pPr>
+      <w:rPr/>
     </w:lvl>
     <w:lvl w:ilvl="4">
       <w:start w:val="1"/>
@@ -2958,6 +2934,7 @@
         </w:tabs>
         <w:ind w:left="2160" w:hanging="360"/>
       </w:pPr>
+      <w:rPr/>
     </w:lvl>
     <w:lvl w:ilvl="5">
       <w:start w:val="1"/>
@@ -2970,6 +2947,7 @@
         </w:tabs>
         <w:ind w:left="2520" w:hanging="360"/>
       </w:pPr>
+      <w:rPr/>
     </w:lvl>
     <w:lvl w:ilvl="6">
       <w:start w:val="1"/>
@@ -2982,6 +2960,7 @@
         </w:tabs>
         <w:ind w:left="2880" w:hanging="360"/>
       </w:pPr>
+      <w:rPr/>
     </w:lvl>
     <w:lvl w:ilvl="7">
       <w:start w:val="1"/>
@@ -2994,6 +2973,7 @@
         </w:tabs>
         <w:ind w:left="3240" w:hanging="360"/>
       </w:pPr>
+      <w:rPr/>
     </w:lvl>
     <w:lvl w:ilvl="8">
       <w:start w:val="1"/>
@@ -3006,6 +2986,7 @@
         </w:tabs>
         <w:ind w:left="3600" w:hanging="360"/>
       </w:pPr>
+      <w:rPr/>
     </w:lvl>
   </w:abstractNum>
   <w:abstractNum w:abstractNumId="7">
@@ -3278,7 +3259,7 @@
   <w:docDefaults>
     <w:rPrDefault>
       <w:rPr>
-        <w:rFonts w:ascii="Cambria" w:hAnsi="Cambria" w:eastAsia="ＭＳ 明朝" w:cs="" w:asciiTheme="minorHAnsi" w:cstheme="minorBidi" w:eastAsiaTheme="minorEastAsia" w:hAnsiTheme="minorHAnsi"/>
+        <w:rFonts w:ascii="Arial" w:hAnsi="Arial" w:eastAsia="DejaVu Sans" w:cs="DejaVu Sans" w:asciiTheme="minorHAnsi" w:cstheme="minorBidi" w:eastAsiaTheme="minorEastAsia" w:hAnsiTheme="minorHAnsi"/>
         <w:sz w:val="22"/>
         <w:szCs w:val="22"/>
         <w:lang w:val="en-US" w:eastAsia="en-US" w:bidi="ar-SA"/>
@@ -3435,12 +3416,13 @@
     <w:rsid w:val="00fc693f"/>
     <w:pPr>
       <w:widowControl/>
+      <w:suppressAutoHyphens w:val="true"/>
       <w:bidi w:val="0"/>
       <w:spacing w:lineRule="auto" w:line="276" w:before="0" w:after="200"/>
       <w:jc w:val="left"/>
     </w:pPr>
     <w:rPr>
-      <w:rFonts w:ascii="Times New Roman" w:hAnsi="Times New Roman" w:eastAsia="Times New Roman" w:cs="" w:cstheme="minorBidi"/>
+      <w:rFonts w:ascii="Times New Roman" w:hAnsi="Times New Roman" w:eastAsia="Times New Roman" w:cs="DejaVu Sans" w:cstheme="minorBidi"/>
       <w:color w:val="auto"/>
       <w:kern w:val="0"/>
       <w:sz w:val="24"/>
@@ -3463,7 +3445,7 @@
       <w:outlineLvl w:val="0"/>
     </w:pPr>
     <w:rPr>
-      <w:rFonts w:ascii="Calibri" w:hAnsi="Calibri" w:eastAsia="ＭＳ ゴシック" w:cs="" w:asciiTheme="majorHAnsi" w:cstheme="majorBidi" w:eastAsiaTheme="majorEastAsia" w:hAnsiTheme="majorHAnsi"/>
+      <w:rFonts w:ascii="Arial" w:hAnsi="Arial" w:eastAsia="DejaVu Sans" w:cs="DejaVu Sans" w:asciiTheme="majorHAnsi" w:cstheme="majorBidi" w:eastAsiaTheme="majorEastAsia" w:hAnsiTheme="majorHAnsi"/>
       <w:b/>
       <w:bCs/>
       <w:color w:themeColor="accent1" w:themeShade="bf" w:val="365F91"/>
@@ -3487,7 +3469,7 @@
       <w:outlineLvl w:val="1"/>
     </w:pPr>
     <w:rPr>
-      <w:rFonts w:ascii="Calibri" w:hAnsi="Calibri" w:eastAsia="ＭＳ ゴシック" w:cs="" w:asciiTheme="majorHAnsi" w:cstheme="majorBidi" w:eastAsiaTheme="majorEastAsia" w:hAnsiTheme="majorHAnsi"/>
+      <w:rFonts w:ascii="Arial" w:hAnsi="Arial" w:eastAsia="DejaVu Sans" w:cs="DejaVu Sans" w:asciiTheme="majorHAnsi" w:cstheme="majorBidi" w:eastAsiaTheme="majorEastAsia" w:hAnsiTheme="majorHAnsi"/>
       <w:b/>
       <w:bCs/>
       <w:color w:themeColor="accent1" w:val="4F81BD"/>
@@ -3511,7 +3493,7 @@
       <w:outlineLvl w:val="2"/>
     </w:pPr>
     <w:rPr>
-      <w:rFonts w:ascii="Calibri" w:hAnsi="Calibri" w:eastAsia="ＭＳ ゴシック" w:cs="" w:asciiTheme="majorHAnsi" w:cstheme="majorBidi" w:eastAsiaTheme="majorEastAsia" w:hAnsiTheme="majorHAnsi"/>
+      <w:rFonts w:ascii="Arial" w:hAnsi="Arial" w:eastAsia="DejaVu Sans" w:cs="DejaVu Sans" w:asciiTheme="majorHAnsi" w:cstheme="majorBidi" w:eastAsiaTheme="majorEastAsia" w:hAnsiTheme="majorHAnsi"/>
       <w:b/>
       <w:bCs/>
       <w:color w:themeColor="accent1" w:val="4F81BD"/>
@@ -3534,7 +3516,7 @@
       <w:outlineLvl w:val="3"/>
     </w:pPr>
     <w:rPr>
-      <w:rFonts w:ascii="Calibri" w:hAnsi="Calibri" w:eastAsia="ＭＳ ゴシック" w:cs="" w:asciiTheme="majorHAnsi" w:cstheme="majorBidi" w:eastAsiaTheme="majorEastAsia" w:hAnsiTheme="majorHAnsi"/>
+      <w:rFonts w:ascii="Arial" w:hAnsi="Arial" w:eastAsia="DejaVu Sans" w:cs="DejaVu Sans" w:asciiTheme="majorHAnsi" w:cstheme="majorBidi" w:eastAsiaTheme="majorEastAsia" w:hAnsiTheme="majorHAnsi"/>
       <w:b/>
       <w:bCs/>
       <w:i/>
@@ -3559,7 +3541,7 @@
       <w:outlineLvl w:val="4"/>
     </w:pPr>
     <w:rPr>
-      <w:rFonts w:ascii="Calibri" w:hAnsi="Calibri" w:eastAsia="ＭＳ ゴシック" w:cs="" w:asciiTheme="majorHAnsi" w:cstheme="majorBidi" w:eastAsiaTheme="majorEastAsia" w:hAnsiTheme="majorHAnsi"/>
+      <w:rFonts w:ascii="Arial" w:hAnsi="Arial" w:eastAsia="DejaVu Sans" w:cs="DejaVu Sans" w:asciiTheme="majorHAnsi" w:cstheme="majorBidi" w:eastAsiaTheme="majorEastAsia" w:hAnsiTheme="majorHAnsi"/>
       <w:color w:themeColor="accent1" w:themeShade="7f" w:val="243F60"/>
     </w:rPr>
   </w:style>
@@ -3580,7 +3562,7 @@
       <w:outlineLvl w:val="5"/>
     </w:pPr>
     <w:rPr>
-      <w:rFonts w:ascii="Calibri" w:hAnsi="Calibri" w:eastAsia="ＭＳ ゴシック" w:cs="" w:asciiTheme="majorHAnsi" w:cstheme="majorBidi" w:eastAsiaTheme="majorEastAsia" w:hAnsiTheme="majorHAnsi"/>
+      <w:rFonts w:ascii="Arial" w:hAnsi="Arial" w:eastAsia="DejaVu Sans" w:cs="DejaVu Sans" w:asciiTheme="majorHAnsi" w:cstheme="majorBidi" w:eastAsiaTheme="majorEastAsia" w:hAnsiTheme="majorHAnsi"/>
       <w:i/>
       <w:iCs/>
       <w:color w:themeColor="accent1" w:themeShade="7f" w:val="243F60"/>
@@ -3603,7 +3585,7 @@
       <w:outlineLvl w:val="6"/>
     </w:pPr>
     <w:rPr>
-      <w:rFonts w:ascii="Calibri" w:hAnsi="Calibri" w:eastAsia="ＭＳ ゴシック" w:cs="" w:asciiTheme="majorHAnsi" w:cstheme="majorBidi" w:eastAsiaTheme="majorEastAsia" w:hAnsiTheme="majorHAnsi"/>
+      <w:rFonts w:ascii="Arial" w:hAnsi="Arial" w:eastAsia="DejaVu Sans" w:cs="DejaVu Sans" w:asciiTheme="majorHAnsi" w:cstheme="majorBidi" w:eastAsiaTheme="majorEastAsia" w:hAnsiTheme="majorHAnsi"/>
       <w:i/>
       <w:iCs/>
       <w:color w:themeColor="text1" w:themeTint="bf" w:val="404040"/>
@@ -3626,7 +3608,7 @@
       <w:outlineLvl w:val="7"/>
     </w:pPr>
     <w:rPr>
-      <w:rFonts w:ascii="Calibri" w:hAnsi="Calibri" w:eastAsia="ＭＳ ゴシック" w:cs="" w:asciiTheme="majorHAnsi" w:cstheme="majorBidi" w:eastAsiaTheme="majorEastAsia" w:hAnsiTheme="majorHAnsi"/>
+      <w:rFonts w:ascii="Arial" w:hAnsi="Arial" w:eastAsia="DejaVu Sans" w:cs="DejaVu Sans" w:asciiTheme="majorHAnsi" w:cstheme="majorBidi" w:eastAsiaTheme="majorEastAsia" w:hAnsiTheme="majorHAnsi"/>
       <w:color w:themeColor="accent1" w:val="4F81BD"/>
       <w:sz w:val="20"/>
       <w:szCs w:val="20"/>
@@ -3649,7 +3631,7 @@
       <w:outlineLvl w:val="8"/>
     </w:pPr>
     <w:rPr>
-      <w:rFonts w:ascii="Calibri" w:hAnsi="Calibri" w:eastAsia="ＭＳ ゴシック" w:cs="" w:asciiTheme="majorHAnsi" w:cstheme="majorBidi" w:eastAsiaTheme="majorEastAsia" w:hAnsiTheme="majorHAnsi"/>
+      <w:rFonts w:ascii="Arial" w:hAnsi="Arial" w:eastAsia="DejaVu Sans" w:cs="DejaVu Sans" w:asciiTheme="majorHAnsi" w:cstheme="majorBidi" w:eastAsiaTheme="majorEastAsia" w:hAnsiTheme="majorHAnsi"/>
       <w:i/>
       <w:iCs/>
       <w:color w:themeColor="text1" w:themeTint="bf" w:val="404040"/>
@@ -3691,7 +3673,7 @@
     <w:qFormat/>
     <w:rsid w:val="00fc693f"/>
     <w:rPr>
-      <w:rFonts w:ascii="Calibri" w:hAnsi="Calibri" w:eastAsia="ＭＳ ゴシック" w:cs="" w:asciiTheme="majorHAnsi" w:cstheme="majorBidi" w:eastAsiaTheme="majorEastAsia" w:hAnsiTheme="majorHAnsi"/>
+      <w:rFonts w:ascii="Arial" w:hAnsi="Arial" w:eastAsia="DejaVu Sans" w:cs="DejaVu Sans" w:asciiTheme="majorHAnsi" w:cstheme="majorBidi" w:eastAsiaTheme="majorEastAsia" w:hAnsiTheme="majorHAnsi"/>
       <w:b/>
       <w:bCs/>
       <w:color w:themeColor="accent1" w:themeShade="bf" w:val="365F91"/>
@@ -3707,7 +3689,7 @@
     <w:qFormat/>
     <w:rsid w:val="00fc693f"/>
     <w:rPr>
-      <w:rFonts w:ascii="Calibri" w:hAnsi="Calibri" w:eastAsia="ＭＳ ゴシック" w:cs="" w:asciiTheme="majorHAnsi" w:cstheme="majorBidi" w:eastAsiaTheme="majorEastAsia" w:hAnsiTheme="majorHAnsi"/>
+      <w:rFonts w:ascii="Arial" w:hAnsi="Arial" w:eastAsia="DejaVu Sans" w:cs="DejaVu Sans" w:asciiTheme="majorHAnsi" w:cstheme="majorBidi" w:eastAsiaTheme="majorEastAsia" w:hAnsiTheme="majorHAnsi"/>
       <w:b/>
       <w:bCs/>
       <w:color w:themeColor="accent1" w:val="4F81BD"/>
@@ -3723,7 +3705,7 @@
     <w:qFormat/>
     <w:rsid w:val="00fc693f"/>
     <w:rPr>
-      <w:rFonts w:ascii="Calibri" w:hAnsi="Calibri" w:eastAsia="ＭＳ ゴシック" w:cs="" w:asciiTheme="majorHAnsi" w:cstheme="majorBidi" w:eastAsiaTheme="majorEastAsia" w:hAnsiTheme="majorHAnsi"/>
+      <w:rFonts w:ascii="Arial" w:hAnsi="Arial" w:eastAsia="DejaVu Sans" w:cs="DejaVu Sans" w:asciiTheme="majorHAnsi" w:cstheme="majorBidi" w:eastAsiaTheme="majorEastAsia" w:hAnsiTheme="majorHAnsi"/>
       <w:b/>
       <w:bCs/>
       <w:color w:themeColor="accent1" w:val="4F81BD"/>
@@ -3737,7 +3719,7 @@
     <w:qFormat/>
     <w:rsid w:val="00fc693f"/>
     <w:rPr>
-      <w:rFonts w:ascii="Calibri" w:hAnsi="Calibri" w:eastAsia="ＭＳ ゴシック" w:cs="" w:asciiTheme="majorHAnsi" w:cstheme="majorBidi" w:eastAsiaTheme="majorEastAsia" w:hAnsiTheme="majorHAnsi"/>
+      <w:rFonts w:ascii="Arial" w:hAnsi="Arial" w:eastAsia="DejaVu Sans" w:cs="DejaVu Sans" w:asciiTheme="majorHAnsi" w:cstheme="majorBidi" w:eastAsiaTheme="majorEastAsia" w:hAnsiTheme="majorHAnsi"/>
       <w:color w:themeColor="text2" w:themeShade="bf" w:val="17365D"/>
       <w:spacing w:val="5"/>
       <w:kern w:val="2"/>
@@ -3753,7 +3735,7 @@
     <w:qFormat/>
     <w:rsid w:val="00fc693f"/>
     <w:rPr>
-      <w:rFonts w:ascii="Calibri" w:hAnsi="Calibri" w:eastAsia="ＭＳ ゴシック" w:cs="" w:asciiTheme="majorHAnsi" w:cstheme="majorBidi" w:eastAsiaTheme="majorEastAsia" w:hAnsiTheme="majorHAnsi"/>
+      <w:rFonts w:ascii="Arial" w:hAnsi="Arial" w:eastAsia="DejaVu Sans" w:cs="DejaVu Sans" w:asciiTheme="majorHAnsi" w:cstheme="majorBidi" w:eastAsiaTheme="majorEastAsia" w:hAnsiTheme="majorHAnsi"/>
       <w:i/>
       <w:iCs/>
       <w:color w:themeColor="accent1" w:val="4F81BD"/>
@@ -3826,7 +3808,7 @@
     <w:qFormat/>
     <w:rsid w:val="00fc693f"/>
     <w:rPr>
-      <w:rFonts w:ascii="Calibri" w:hAnsi="Calibri" w:eastAsia="ＭＳ ゴシック" w:cs="" w:asciiTheme="majorHAnsi" w:cstheme="majorBidi" w:eastAsiaTheme="majorEastAsia" w:hAnsiTheme="majorHAnsi"/>
+      <w:rFonts w:ascii="Arial" w:hAnsi="Arial" w:eastAsia="DejaVu Sans" w:cs="DejaVu Sans" w:asciiTheme="majorHAnsi" w:cstheme="majorBidi" w:eastAsiaTheme="majorEastAsia" w:hAnsiTheme="majorHAnsi"/>
       <w:b/>
       <w:bCs/>
       <w:i/>
@@ -3843,7 +3825,7 @@
     <w:qFormat/>
     <w:rsid w:val="00fc693f"/>
     <w:rPr>
-      <w:rFonts w:ascii="Calibri" w:hAnsi="Calibri" w:eastAsia="ＭＳ ゴシック" w:cs="" w:asciiTheme="majorHAnsi" w:cstheme="majorBidi" w:eastAsiaTheme="majorEastAsia" w:hAnsiTheme="majorHAnsi"/>
+      <w:rFonts w:ascii="Arial" w:hAnsi="Arial" w:eastAsia="DejaVu Sans" w:cs="DejaVu Sans" w:asciiTheme="majorHAnsi" w:cstheme="majorBidi" w:eastAsiaTheme="majorEastAsia" w:hAnsiTheme="majorHAnsi"/>
       <w:color w:themeColor="accent1" w:themeShade="7f" w:val="243F60"/>
     </w:rPr>
   </w:style>
@@ -3856,7 +3838,7 @@
     <w:qFormat/>
     <w:rsid w:val="00fc693f"/>
     <w:rPr>
-      <w:rFonts w:ascii="Calibri" w:hAnsi="Calibri" w:eastAsia="ＭＳ ゴシック" w:cs="" w:asciiTheme="majorHAnsi" w:cstheme="majorBidi" w:eastAsiaTheme="majorEastAsia" w:hAnsiTheme="majorHAnsi"/>
+      <w:rFonts w:ascii="Arial" w:hAnsi="Arial" w:eastAsia="DejaVu Sans" w:cs="DejaVu Sans" w:asciiTheme="majorHAnsi" w:cstheme="majorBidi" w:eastAsiaTheme="majorEastAsia" w:hAnsiTheme="majorHAnsi"/>
       <w:i/>
       <w:iCs/>
       <w:color w:themeColor="accent1" w:themeShade="7f" w:val="243F60"/>
@@ -3871,7 +3853,7 @@
     <w:qFormat/>
     <w:rsid w:val="00fc693f"/>
     <w:rPr>
-      <w:rFonts w:ascii="Calibri" w:hAnsi="Calibri" w:eastAsia="ＭＳ ゴシック" w:cs="" w:asciiTheme="majorHAnsi" w:cstheme="majorBidi" w:eastAsiaTheme="majorEastAsia" w:hAnsiTheme="majorHAnsi"/>
+      <w:rFonts w:ascii="Arial" w:hAnsi="Arial" w:eastAsia="DejaVu Sans" w:cs="DejaVu Sans" w:asciiTheme="majorHAnsi" w:cstheme="majorBidi" w:eastAsiaTheme="majorEastAsia" w:hAnsiTheme="majorHAnsi"/>
       <w:i/>
       <w:iCs/>
       <w:color w:themeColor="text1" w:themeTint="bf" w:val="404040"/>
@@ -3886,7 +3868,7 @@
     <w:qFormat/>
     <w:rsid w:val="00fc693f"/>
     <w:rPr>
-      <w:rFonts w:ascii="Calibri" w:hAnsi="Calibri" w:eastAsia="ＭＳ ゴシック" w:cs="" w:asciiTheme="majorHAnsi" w:cstheme="majorBidi" w:eastAsiaTheme="majorEastAsia" w:hAnsiTheme="majorHAnsi"/>
+      <w:rFonts w:ascii="Arial" w:hAnsi="Arial" w:eastAsia="DejaVu Sans" w:cs="DejaVu Sans" w:asciiTheme="majorHAnsi" w:cstheme="majorBidi" w:eastAsiaTheme="majorEastAsia" w:hAnsiTheme="majorHAnsi"/>
       <w:color w:themeColor="accent1" w:val="4F81BD"/>
       <w:sz w:val="20"/>
       <w:szCs w:val="20"/>
@@ -3901,7 +3883,7 @@
     <w:qFormat/>
     <w:rsid w:val="00fc693f"/>
     <w:rPr>
-      <w:rFonts w:ascii="Calibri" w:hAnsi="Calibri" w:eastAsia="ＭＳ ゴシック" w:cs="" w:asciiTheme="majorHAnsi" w:cstheme="majorBidi" w:eastAsiaTheme="majorEastAsia" w:hAnsiTheme="majorHAnsi"/>
+      <w:rFonts w:ascii="Arial" w:hAnsi="Arial" w:eastAsia="DejaVu Sans" w:cs="DejaVu Sans" w:asciiTheme="majorHAnsi" w:cstheme="majorBidi" w:eastAsiaTheme="majorEastAsia" w:hAnsiTheme="majorHAnsi"/>
       <w:i/>
       <w:iCs/>
       <w:color w:themeColor="text1" w:themeTint="bf" w:val="404040"/>
@@ -4160,12 +4142,13 @@
     <w:rsid w:val="00fc693f"/>
     <w:pPr>
       <w:widowControl/>
+      <w:suppressAutoHyphens w:val="true"/>
       <w:bidi w:val="0"/>
       <w:spacing w:lineRule="auto" w:line="240" w:before="0" w:after="0"/>
       <w:jc w:val="left"/>
     </w:pPr>
     <w:rPr>
-      <w:rFonts w:ascii="Cambria" w:hAnsi="Cambria" w:eastAsia="ＭＳ 明朝" w:cs="" w:asciiTheme="minorHAnsi" w:cstheme="minorBidi" w:eastAsiaTheme="minorEastAsia" w:hAnsiTheme="minorHAnsi"/>
+      <w:rFonts w:ascii="Arial" w:hAnsi="Arial" w:eastAsia="DejaVu Sans" w:cs="DejaVu Sans" w:asciiTheme="minorHAnsi" w:cstheme="minorBidi" w:eastAsiaTheme="minorEastAsia" w:hAnsiTheme="minorHAnsi"/>
       <w:color w:val="auto"/>
       <w:kern w:val="0"/>
       <w:sz w:val="22"/>
@@ -4189,7 +4172,7 @@
       <w:contextualSpacing/>
     </w:pPr>
     <w:rPr>
-      <w:rFonts w:ascii="Calibri" w:hAnsi="Calibri" w:eastAsia="ＭＳ ゴシック" w:cs="" w:asciiTheme="majorHAnsi" w:cstheme="majorBidi" w:eastAsiaTheme="majorEastAsia" w:hAnsiTheme="majorHAnsi"/>
+      <w:rFonts w:ascii="Arial" w:hAnsi="Arial" w:eastAsia="DejaVu Sans" w:cs="DejaVu Sans" w:asciiTheme="majorHAnsi" w:cstheme="majorBidi" w:eastAsiaTheme="majorEastAsia" w:hAnsiTheme="majorHAnsi"/>
       <w:color w:themeColor="text2" w:themeShade="bf" w:val="17365D"/>
       <w:spacing w:val="5"/>
       <w:kern w:val="2"/>
@@ -4207,7 +4190,7 @@
     <w:rsid w:val="00fc693f"/>
     <w:pPr/>
     <w:rPr>
-      <w:rFonts w:ascii="Calibri" w:hAnsi="Calibri" w:eastAsia="ＭＳ ゴシック" w:cs="" w:asciiTheme="majorHAnsi" w:cstheme="majorBidi" w:eastAsiaTheme="majorEastAsia" w:hAnsiTheme="majorHAnsi"/>
+      <w:rFonts w:ascii="Arial" w:hAnsi="Arial" w:eastAsia="DejaVu Sans" w:cs="DejaVu Sans" w:asciiTheme="majorHAnsi" w:cstheme="majorBidi" w:eastAsiaTheme="majorEastAsia" w:hAnsiTheme="majorHAnsi"/>
       <w:i/>
       <w:iCs/>
       <w:color w:themeColor="accent1" w:val="4F81BD"/>
@@ -4440,12 +4423,13 @@
         <w:tab w:val="left" w:pos="3456" w:leader="none"/>
         <w:tab w:val="left" w:pos="4032" w:leader="none"/>
       </w:tabs>
+      <w:suppressAutoHyphens w:val="true"/>
       <w:bidi w:val="0"/>
       <w:spacing w:lineRule="auto" w:line="276" w:before="0" w:after="200"/>
       <w:jc w:val="left"/>
     </w:pPr>
     <w:rPr>
-      <w:rFonts w:ascii="Courier" w:hAnsi="Courier" w:eastAsia="ＭＳ 明朝" w:cs="" w:cstheme="minorBidi" w:eastAsiaTheme="minorEastAsia"/>
+      <w:rFonts w:ascii="Courier" w:hAnsi="Courier" w:eastAsia="DejaVu Sans" w:cs="DejaVu Sans" w:cstheme="minorBidi" w:eastAsiaTheme="minorEastAsia"/>
       <w:color w:val="auto"/>
       <w:kern w:val="0"/>
       <w:sz w:val="20"/>
@@ -7652,7 +7636,6 @@
       <w:pPr>
         <w:spacing w:before="0" w:after="0" w:line="240" w:lineRule="auto"/>
       </w:pPr>
-      <w:rPr/>
       <w:tblPr/>
       <w:tcPr>
         <w:tcBorders>
@@ -7798,7 +7781,6 @@
       <w:pPr>
         <w:spacing w:before="0" w:after="0" w:line="240" w:lineRule="auto"/>
       </w:pPr>
-      <w:rPr/>
       <w:tblPr/>
       <w:tcPr>
         <w:tcBorders>
@@ -7944,7 +7926,6 @@
       <w:pPr>
         <w:spacing w:before="0" w:after="0" w:line="240" w:lineRule="auto"/>
       </w:pPr>
-      <w:rPr/>
       <w:tblPr/>
       <w:tcPr>
         <w:tcBorders>
@@ -8090,7 +8071,6 @@
       <w:pPr>
         <w:spacing w:before="0" w:after="0" w:line="240" w:lineRule="auto"/>
       </w:pPr>
-      <w:rPr/>
       <w:tblPr/>
       <w:tcPr>
         <w:tcBorders>
@@ -8236,7 +8216,6 @@
       <w:pPr>
         <w:spacing w:before="0" w:after="0" w:line="240" w:lineRule="auto"/>
       </w:pPr>
-      <w:rPr/>
       <w:tblPr/>
       <w:tcPr>
         <w:tcBorders>
@@ -8382,7 +8361,6 @@
       <w:pPr>
         <w:spacing w:before="0" w:after="0" w:line="240" w:lineRule="auto"/>
       </w:pPr>
-      <w:rPr/>
       <w:tblPr/>
       <w:tcPr>
         <w:tcBorders>
@@ -8528,7 +8506,6 @@
       <w:pPr>
         <w:spacing w:before="0" w:after="0" w:line="240" w:lineRule="auto"/>
       </w:pPr>
-      <w:rPr/>
       <w:tblPr/>
       <w:tcPr>
         <w:tcBorders>

</xml_diff>

<commit_message>
Fix kunci .docx tidak terbaca: dukung auto-numbering Word, tabel 'No|Kunci', dan header 'KUNCI JAWABAN: 1.A 2.B' (fallback positional + regex global)
</commit_message>
<xml_diff>
--- a/template/25_Soal_TKA_Bahasa_Indonesia_SD_MI_Literasi.docx
+++ b/template/25_Soal_TKA_Bahasa_Indonesia_SD_MI_Literasi.docx
@@ -1740,15 +1740,6 @@
       <w:r>
         <w:rPr/>
         <w:t>D. Warga sebaiknya tidak membersihkan sungai.</w:t>
-      </w:r>
-    </w:p>
-    <w:p>
-      <w:pPr>
-        <w:pStyle w:val="Normal"/>
-        <w:rPr/>
-      </w:pPr>
-      <w:r>
-        <w:rPr/>
       </w:r>
     </w:p>
     <w:p>

</xml_diff>

<commit_message>
Fix exam session cleanup, set duration to 90min, add server-side time validation, improve token entropy for admin-activated exams
</commit_message>
<xml_diff>
--- a/template/25_Soal_TKA_Bahasa_Indonesia_SD_MI_Literasi.docx
+++ b/template/25_Soal_TKA_Bahasa_Indonesia_SD_MI_Literasi.docx
@@ -36,6 +36,24 @@
           <w:sz w:val="26"/>
         </w:rPr>
         <w:t>JENJANG: SD</w:t>
+      </w:r>
+    </w:p>
+    <w:p>
+      <w:pPr>
+        <w:pStyle w:val="Normal"/>
+        <w:rPr>
+          <w:b/>
+          <w:color w:val="1D4ED8"/>
+          <w:sz w:val="26"/>
+        </w:rPr>
+      </w:pPr>
+      <w:r>
+        <w:rPr>
+          <w:b/>
+          <w:color w:val="1D4ED8"/>
+          <w:sz w:val="26"/>
+        </w:rPr>
+        <w:t>MAPEL: BAHASA INDONESIA</w:t>
       </w:r>
     </w:p>
     <w:p>

</xml_diff>